<commit_message>
Attached link to the report
</commit_message>
<xml_diff>
--- a/Project Report.docx
+++ b/Project Report.docx
@@ -5,6 +5,7 @@
     <w:sdt>
       <w:sdtPr>
         <w:rPr>
+          <w:rFonts w:eastAsiaTheme="minorHAnsi"/>
           <w:color w:val="5B9BD5" w:themeColor="accent1"/>
         </w:rPr>
         <w:id w:val="-936519809"/>
@@ -15,7 +16,6 @@
       </w:sdtPr>
       <w:sdtEndPr>
         <w:rPr>
-          <w:rFonts w:eastAsiaTheme="minorHAnsi"/>
           <w:color w:val="auto"/>
         </w:rPr>
       </w:sdtEndPr>
@@ -159,6 +159,7 @@
             <w:dataBinding w:prefixMappings="xmlns:ns0='http://purl.org/dc/elements/1.1/' xmlns:ns1='http://schemas.openxmlformats.org/package/2006/metadata/core-properties' " w:xpath="/ns1:coreProperties[1]/ns0:subject[1]" w:storeItemID="{6C3C8BC8-F283-45AE-878A-BAB7291924A1}"/>
             <w:text/>
           </w:sdtPr>
+          <w:sdtEndPr/>
           <w:sdtContent>
             <w:p>
               <w:pPr>
@@ -273,6 +274,7 @@
                                     <w:calendar w:val="gregorian"/>
                                   </w:date>
                                 </w:sdtPr>
+                                <w:sdtEndPr/>
                                 <w:sdtContent>
                                   <w:p>
                                     <w:pPr>
@@ -318,6 +320,7 @@
                                     <w:dataBinding w:prefixMappings="xmlns:ns0='http://schemas.openxmlformats.org/officeDocument/2006/extended-properties' " w:xpath="/ns0:Properties[1]/ns0:Company[1]" w:storeItemID="{6668398D-A668-4E3E-A5EB-62B293D839F1}"/>
                                     <w:text/>
                                   </w:sdtPr>
+                                  <w:sdtEndPr/>
                                   <w:sdtContent>
                                     <w:r>
                                       <w:rPr>
@@ -348,6 +351,7 @@
                                     <w:dataBinding w:prefixMappings="xmlns:ns0='http://schemas.microsoft.com/office/2006/coverPageProps' " w:xpath="/ns0:CoverPageProperties[1]/ns0:CompanyAddress[1]" w:storeItemID="{55AF091B-3C7A-41E3-B477-F2FDAA23CFDA}"/>
                                     <w:text/>
                                   </w:sdtPr>
+                                  <w:sdtEndPr/>
                                   <w:sdtContent>
                                     <w:r>
                                       <w:rPr>
@@ -830,23 +834,7 @@
                 <w:sz w:val="24"/>
                 <w:szCs w:val="24"/>
               </w:rPr>
-              <w:t xml:space="preserve">, </w:t>
-            </w:r>
-            <w:r>
-              <w:rPr>
-                <w:rFonts w:ascii="Arial" w:eastAsia="Times New Roman" w:hAnsi="Arial" w:cs="Arial"/>
-                <w:sz w:val="24"/>
-                <w:szCs w:val="24"/>
-              </w:rPr>
-              <w:t>F2024376070</w:t>
-            </w:r>
-            <w:r>
-              <w:rPr>
-                <w:rFonts w:ascii="Arial" w:eastAsia="Times New Roman" w:hAnsi="Arial" w:cs="Arial"/>
-                <w:sz w:val="24"/>
-                <w:szCs w:val="24"/>
-              </w:rPr>
-              <w:t>, F2024376165</w:t>
+              <w:t>, F2024376070, F2024376165</w:t>
             </w:r>
           </w:p>
         </w:tc>
@@ -909,15 +897,7 @@
                 <w:sz w:val="24"/>
                 <w:szCs w:val="24"/>
               </w:rPr>
-              <w:t xml:space="preserve"> </w:t>
-            </w:r>
-            <w:r>
-              <w:rPr>
-                <w:rFonts w:ascii="Arial" w:eastAsia="Times New Roman" w:hAnsi="Arial" w:cs="Arial"/>
-                <w:sz w:val="24"/>
-                <w:szCs w:val="24"/>
-              </w:rPr>
-              <w:t>Web Technologies</w:t>
+              <w:t xml:space="preserve"> Web Technologies</w:t>
             </w:r>
           </w:p>
         </w:tc>
@@ -1027,15 +1007,7 @@
                 <w:sz w:val="24"/>
                 <w:szCs w:val="24"/>
               </w:rPr>
-              <w:t>19/06</w:t>
-            </w:r>
-            <w:r>
-              <w:rPr>
-                <w:rFonts w:ascii="Arial" w:eastAsia="Times New Roman" w:hAnsi="Arial" w:cs="Arial"/>
-                <w:sz w:val="24"/>
-                <w:szCs w:val="24"/>
-              </w:rPr>
-              <w:t>/2026</w:t>
+              <w:t>19/06/2026</w:t>
             </w:r>
           </w:p>
         </w:tc>
@@ -1130,8 +1102,6 @@
       <w:pPr>
         <w:jc w:val="both"/>
       </w:pPr>
-      <w:bookmarkStart w:id="0" w:name="_GoBack"/>
-      <w:bookmarkEnd w:id="0"/>
     </w:p>
     <w:p>
       <w:pPr>
@@ -1145,6 +1115,12 @@
     </w:p>
     <w:sdt>
       <w:sdtPr>
+        <w:rPr>
+          <w:rFonts w:asciiTheme="minorHAnsi" w:eastAsiaTheme="minorHAnsi" w:hAnsiTheme="minorHAnsi" w:cstheme="minorBidi"/>
+          <w:color w:val="auto"/>
+          <w:sz w:val="22"/>
+          <w:szCs w:val="22"/>
+        </w:rPr>
         <w:id w:val="774680538"/>
         <w:docPartObj>
           <w:docPartGallery w:val="Table of Contents"/>
@@ -1153,13 +1129,9 @@
       </w:sdtPr>
       <w:sdtEndPr>
         <w:rPr>
-          <w:rFonts w:asciiTheme="minorHAnsi" w:eastAsiaTheme="minorHAnsi" w:hAnsiTheme="minorHAnsi" w:cstheme="minorBidi"/>
           <w:b/>
           <w:bCs/>
           <w:noProof/>
-          <w:color w:val="auto"/>
-          <w:sz w:val="22"/>
-          <w:szCs w:val="22"/>
         </w:rPr>
       </w:sdtEndPr>
       <w:sdtContent>
@@ -2634,7 +2606,7 @@
           <w:bCs/>
         </w:rPr>
       </w:pPr>
-      <w:bookmarkStart w:id="1" w:name="_Toc232970509"/>
+      <w:bookmarkStart w:id="0" w:name="_Toc232970509"/>
       <w:r>
         <w:rPr>
           <w:b/>
@@ -2649,7 +2621,7 @@
         </w:rPr>
         <w:t>:</w:t>
       </w:r>
-      <w:bookmarkEnd w:id="1"/>
+      <w:bookmarkEnd w:id="0"/>
     </w:p>
     <w:p>
       <w:pPr>
@@ -2707,7 +2679,7 @@
           <w:bCs/>
         </w:rPr>
       </w:pPr>
-      <w:bookmarkStart w:id="2" w:name="_Toc232970510"/>
+      <w:bookmarkStart w:id="1" w:name="_Toc232970510"/>
       <w:r>
         <w:rPr>
           <w:b/>
@@ -2723,7 +2695,7 @@
         </w:rPr>
         <w:t>:</w:t>
       </w:r>
-      <w:bookmarkEnd w:id="2"/>
+      <w:bookmarkEnd w:id="1"/>
     </w:p>
     <w:p>
       <w:pPr>
@@ -2861,7 +2833,7 @@
           <w:bCs/>
         </w:rPr>
       </w:pPr>
-      <w:bookmarkStart w:id="3" w:name="_Toc232970511"/>
+      <w:bookmarkStart w:id="2" w:name="_Toc232970511"/>
       <w:r>
         <w:rPr>
           <w:b/>
@@ -2876,7 +2848,7 @@
         </w:rPr>
         <w:t>:</w:t>
       </w:r>
-      <w:bookmarkEnd w:id="3"/>
+      <w:bookmarkEnd w:id="2"/>
     </w:p>
     <w:tbl>
       <w:tblPr>
@@ -3262,7 +3234,7 @@
           <w:bCs/>
         </w:rPr>
       </w:pPr>
-      <w:bookmarkStart w:id="4" w:name="_Toc232970512"/>
+      <w:bookmarkStart w:id="3" w:name="_Toc232970512"/>
     </w:p>
     <w:p>
       <w:pPr>
@@ -3313,7 +3285,7 @@
         </w:rPr>
         <w:t>:</w:t>
       </w:r>
-      <w:bookmarkEnd w:id="4"/>
+      <w:bookmarkEnd w:id="3"/>
     </w:p>
     <w:p>
       <w:pPr>
@@ -3768,7 +3740,7 @@
           <w:bCs/>
         </w:rPr>
       </w:pPr>
-      <w:bookmarkStart w:id="5" w:name="_Toc232970513"/>
+      <w:bookmarkStart w:id="4" w:name="_Toc232970513"/>
       <w:r>
         <w:rPr>
           <w:b/>
@@ -3784,48 +3756,48 @@
         </w:rPr>
         <w:t>:</w:t>
       </w:r>
+      <w:bookmarkEnd w:id="4"/>
+    </w:p>
+    <w:p>
+      <w:pPr>
+        <w:pStyle w:val="Heading2"/>
+        <w:jc w:val="both"/>
+        <w:rPr>
+          <w:b/>
+        </w:rPr>
+      </w:pPr>
+      <w:bookmarkStart w:id="5" w:name="_Toc232970514"/>
+      <w:r>
+        <w:rPr>
+          <w:b/>
+        </w:rPr>
+        <w:t>Main (</w:t>
+      </w:r>
+      <w:r>
+        <w:rPr>
+          <w:b/>
+        </w:rPr>
+        <w:t>First Question</w:t>
+      </w:r>
+      <w:r>
+        <w:rPr>
+          <w:b/>
+        </w:rPr>
+        <w:t>)</w:t>
+      </w:r>
+      <w:r>
+        <w:rPr>
+          <w:b/>
+        </w:rPr>
+        <w:t xml:space="preserve"> Display</w:t>
+      </w:r>
+      <w:r>
+        <w:rPr>
+          <w:b/>
+        </w:rPr>
+        <w:t>:</w:t>
+      </w:r>
       <w:bookmarkEnd w:id="5"/>
-    </w:p>
-    <w:p>
-      <w:pPr>
-        <w:pStyle w:val="Heading2"/>
-        <w:jc w:val="both"/>
-        <w:rPr>
-          <w:b/>
-        </w:rPr>
-      </w:pPr>
-      <w:bookmarkStart w:id="6" w:name="_Toc232970514"/>
-      <w:r>
-        <w:rPr>
-          <w:b/>
-        </w:rPr>
-        <w:t>Main (</w:t>
-      </w:r>
-      <w:r>
-        <w:rPr>
-          <w:b/>
-        </w:rPr>
-        <w:t>First Question</w:t>
-      </w:r>
-      <w:r>
-        <w:rPr>
-          <w:b/>
-        </w:rPr>
-        <w:t>)</w:t>
-      </w:r>
-      <w:r>
-        <w:rPr>
-          <w:b/>
-        </w:rPr>
-        <w:t xml:space="preserve"> Display</w:t>
-      </w:r>
-      <w:r>
-        <w:rPr>
-          <w:b/>
-        </w:rPr>
-        <w:t>:</w:t>
-      </w:r>
-      <w:bookmarkEnd w:id="6"/>
     </w:p>
     <w:p>
       <w:pPr>
@@ -3899,7 +3871,7 @@
           <w:bCs/>
         </w:rPr>
       </w:pPr>
-      <w:bookmarkStart w:id="7" w:name="_Toc232970515"/>
+      <w:bookmarkStart w:id="6" w:name="_Toc232970515"/>
       <w:r>
         <w:rPr>
           <w:b/>
@@ -3914,7 +3886,7 @@
         </w:rPr>
         <w:t>:</w:t>
       </w:r>
-      <w:bookmarkEnd w:id="7"/>
+      <w:bookmarkEnd w:id="6"/>
     </w:p>
     <w:p>
       <w:pPr>
@@ -3976,7 +3948,7 @@
           <w:bCs/>
         </w:rPr>
       </w:pPr>
-      <w:bookmarkStart w:id="8" w:name="_Toc232970516"/>
+      <w:bookmarkStart w:id="7" w:name="_Toc232970516"/>
       <w:r>
         <w:rPr>
           <w:b/>
@@ -3992,7 +3964,7 @@
         </w:rPr>
         <w:t>:</w:t>
       </w:r>
-      <w:bookmarkEnd w:id="8"/>
+      <w:bookmarkEnd w:id="7"/>
     </w:p>
     <w:p>
       <w:pPr>
@@ -4059,7 +4031,7 @@
           <w:bCs/>
         </w:rPr>
       </w:pPr>
-      <w:bookmarkStart w:id="9" w:name="_Toc232970517"/>
+      <w:bookmarkStart w:id="8" w:name="_Toc232970517"/>
       <w:r>
         <w:rPr>
           <w:b/>
@@ -4075,7 +4047,7 @@
         </w:rPr>
         <w:t>:</w:t>
       </w:r>
-      <w:bookmarkEnd w:id="9"/>
+      <w:bookmarkEnd w:id="8"/>
     </w:p>
     <w:p>
       <w:pPr>
@@ -4142,7 +4114,7 @@
           <w:bCs/>
         </w:rPr>
       </w:pPr>
-      <w:bookmarkStart w:id="10" w:name="_Toc232970518"/>
+      <w:bookmarkStart w:id="9" w:name="_Toc232970518"/>
       <w:r>
         <w:rPr>
           <w:b/>
@@ -4158,7 +4130,7 @@
         </w:rPr>
         <w:t>:</w:t>
       </w:r>
-      <w:bookmarkEnd w:id="10"/>
+      <w:bookmarkEnd w:id="9"/>
     </w:p>
     <w:p>
       <w:pPr>
@@ -4225,7 +4197,7 @@
           <w:bCs/>
         </w:rPr>
       </w:pPr>
-      <w:bookmarkStart w:id="11" w:name="_Toc232970519"/>
+      <w:bookmarkStart w:id="10" w:name="_Toc232970519"/>
       <w:r>
         <w:rPr>
           <w:b/>
@@ -4241,7 +4213,7 @@
         </w:rPr>
         <w:t>:</w:t>
       </w:r>
-      <w:bookmarkEnd w:id="11"/>
+      <w:bookmarkEnd w:id="10"/>
     </w:p>
     <w:p>
       <w:pPr>
@@ -4308,7 +4280,7 @@
           <w:bCs/>
         </w:rPr>
       </w:pPr>
-      <w:bookmarkStart w:id="12" w:name="_Toc232970520"/>
+      <w:bookmarkStart w:id="11" w:name="_Toc232970520"/>
       <w:r>
         <w:rPr>
           <w:b/>
@@ -4324,7 +4296,7 @@
         </w:rPr>
         <w:t>:</w:t>
       </w:r>
-      <w:bookmarkEnd w:id="12"/>
+      <w:bookmarkEnd w:id="11"/>
     </w:p>
     <w:p>
       <w:pPr>
@@ -4386,7 +4358,7 @@
           <w:bCs/>
         </w:rPr>
       </w:pPr>
-      <w:bookmarkStart w:id="13" w:name="_Toc232970521"/>
+      <w:bookmarkStart w:id="12" w:name="_Toc232970521"/>
       <w:r>
         <w:rPr>
           <w:b/>
@@ -4402,7 +4374,7 @@
         </w:rPr>
         <w:t>:</w:t>
       </w:r>
-      <w:bookmarkEnd w:id="13"/>
+      <w:bookmarkEnd w:id="12"/>
     </w:p>
     <w:p>
       <w:pPr>
@@ -5187,7 +5159,7 @@
           <w:bCs/>
         </w:rPr>
       </w:pPr>
-      <w:bookmarkStart w:id="14" w:name="_Toc232970522"/>
+      <w:bookmarkStart w:id="13" w:name="_Toc232970522"/>
       <w:r>
         <w:rPr>
           <w:b/>
@@ -5202,26 +5174,26 @@
         </w:rPr>
         <w:t>:</w:t>
       </w:r>
+      <w:bookmarkEnd w:id="13"/>
+    </w:p>
+    <w:p>
+      <w:pPr>
+        <w:pStyle w:val="Heading2"/>
+        <w:jc w:val="both"/>
+        <w:rPr>
+          <w:b/>
+          <w:bCs/>
+        </w:rPr>
+      </w:pPr>
+      <w:bookmarkStart w:id="14" w:name="_Toc232970523"/>
+      <w:r>
+        <w:rPr>
+          <w:b/>
+          <w:bCs/>
+        </w:rPr>
+        <w:t>HTML Structure:</w:t>
+      </w:r>
       <w:bookmarkEnd w:id="14"/>
-    </w:p>
-    <w:p>
-      <w:pPr>
-        <w:pStyle w:val="Heading2"/>
-        <w:jc w:val="both"/>
-        <w:rPr>
-          <w:b/>
-          <w:bCs/>
-        </w:rPr>
-      </w:pPr>
-      <w:bookmarkStart w:id="15" w:name="_Toc232970523"/>
-      <w:r>
-        <w:rPr>
-          <w:b/>
-          <w:bCs/>
-        </w:rPr>
-        <w:t>HTML Structure:</w:t>
-      </w:r>
-      <w:bookmarkEnd w:id="15"/>
     </w:p>
     <w:p>
       <w:pPr>
@@ -5430,7 +5402,7 @@
           <w:bCs/>
         </w:rPr>
       </w:pPr>
-      <w:bookmarkStart w:id="16" w:name="_Toc232970524"/>
+      <w:bookmarkStart w:id="15" w:name="_Toc232970524"/>
       <w:r>
         <w:rPr>
           <w:b/>
@@ -5446,7 +5418,7 @@
         </w:rPr>
         <w:t>:</w:t>
       </w:r>
-      <w:bookmarkEnd w:id="16"/>
+      <w:bookmarkEnd w:id="15"/>
     </w:p>
     <w:p>
       <w:pPr>
@@ -5645,7 +5617,7 @@
           <w:bCs/>
         </w:rPr>
       </w:pPr>
-      <w:bookmarkStart w:id="17" w:name="_Toc232970525"/>
+      <w:bookmarkStart w:id="16" w:name="_Toc232970525"/>
       <w:r>
         <w:rPr>
           <w:b/>
@@ -5660,7 +5632,7 @@
         </w:rPr>
         <w:t>:</w:t>
       </w:r>
-      <w:bookmarkEnd w:id="17"/>
+      <w:bookmarkEnd w:id="16"/>
     </w:p>
     <w:p>
       <w:pPr>
@@ -5912,7 +5884,7 @@
           <w:bCs/>
         </w:rPr>
       </w:pPr>
-      <w:bookmarkStart w:id="18" w:name="_Toc232970526"/>
+      <w:bookmarkStart w:id="17" w:name="_Toc232970526"/>
       <w:r>
         <w:rPr>
           <w:b/>
@@ -5927,7 +5899,7 @@
         </w:rPr>
         <w:t>:</w:t>
       </w:r>
-      <w:bookmarkEnd w:id="18"/>
+      <w:bookmarkEnd w:id="17"/>
     </w:p>
     <w:tbl>
       <w:tblPr>
@@ -6049,10 +6021,7 @@
               <w:t xml:space="preserve"> </w:t>
             </w:r>
             <w:r>
-              <w:t>Results (</w:t>
-            </w:r>
-            <w:r>
-              <w:t>) function to properly hide quiz and show results section</w:t>
+              <w:t>Results () function to properly hide quiz and show results section</w:t>
             </w:r>
             <w:r>
               <w:t>.</w:t>
@@ -6208,7 +6177,7 @@
           <w:bCs/>
         </w:rPr>
       </w:pPr>
-      <w:bookmarkStart w:id="19" w:name="_Toc232970527"/>
+      <w:bookmarkStart w:id="18" w:name="_Toc232970527"/>
       <w:r>
         <w:rPr>
           <w:b/>
@@ -6224,7 +6193,7 @@
         </w:rPr>
         <w:t>:</w:t>
       </w:r>
-      <w:bookmarkEnd w:id="19"/>
+      <w:bookmarkEnd w:id="18"/>
     </w:p>
     <w:p>
       <w:pPr>
@@ -6343,7 +6312,10 @@
         <w:jc w:val="both"/>
       </w:pPr>
       <w:r>
-        <w:t>This project has strengthened my understanding of front-end web development and prepared me for projects that are more complex in the future.</w:t>
+        <w:t>This project has strengthened my understanding of front-end web development and prepared me for</w:t>
+      </w:r>
+      <w:r>
+        <w:t xml:space="preserve"> projects that are more complex in the future.</w:t>
       </w:r>
     </w:p>
     <w:p>
@@ -6360,7 +6332,7 @@
           <w:bCs/>
         </w:rPr>
       </w:pPr>
-      <w:bookmarkStart w:id="20" w:name="_Toc232970528"/>
+      <w:bookmarkStart w:id="19" w:name="_Toc232970528"/>
       <w:r>
         <w:rPr>
           <w:b/>
@@ -6375,7 +6347,7 @@
         </w:rPr>
         <w:t>:</w:t>
       </w:r>
-      <w:bookmarkEnd w:id="20"/>
+      <w:bookmarkEnd w:id="19"/>
     </w:p>
     <w:p>
       <w:pPr>
@@ -6499,6 +6471,11 @@
           <w:ilvl w:val="0"/>
           <w:numId w:val="22"/>
         </w:numPr>
+        <w:rPr>
+          <w:rStyle w:val="Hyperlink"/>
+          <w:color w:val="auto"/>
+          <w:u w:val="none"/>
+        </w:rPr>
       </w:pPr>
       <w:hyperlink r:id="rId21" w:tgtFrame="_blank" w:history="1">
         <w:r>
@@ -6527,38 +6504,51 @@
     </w:p>
     <w:p>
       <w:pPr>
+        <w:pStyle w:val="ListParagraph"/>
+        <w:numPr>
+          <w:ilvl w:val="0"/>
+          <w:numId w:val="22"/>
+        </w:numPr>
+        <w:rPr>
+          <w:rStyle w:val="Hyperlink"/>
+          <w:color w:val="auto"/>
+          <w:u w:val="none"/>
+        </w:rPr>
+      </w:pPr>
+      <w:r>
+        <w:rPr>
+          <w:rStyle w:val="Hyperlink"/>
+          <w:color w:val="auto"/>
+          <w:u w:val="none"/>
+        </w:rPr>
+        <w:t>Quiz application</w:t>
+      </w:r>
+      <w:r>
+        <w:rPr>
+          <w:rStyle w:val="Hyperlink"/>
+          <w:color w:val="auto"/>
+          <w:u w:val="none"/>
+        </w:rPr>
+        <w:t xml:space="preserve"> Link: </w:t>
+      </w:r>
+      <w:hyperlink r:id="rId23" w:history="1">
+        <w:r>
+          <w:rPr>
+            <w:rStyle w:val="Hyperlink"/>
+            <w:b/>
+            <w:bCs/>
+          </w:rPr>
+          <w:t>https://darkfear2005or2006-ai.github.io/Quiz-App-Project/</w:t>
+        </w:r>
+      </w:hyperlink>
+    </w:p>
+    <w:p>
+      <w:pPr>
         <w:pStyle w:val="Heading1"/>
         <w:jc w:val="both"/>
       </w:pPr>
-    </w:p>
-    <w:p>
-      <w:pPr>
-        <w:pStyle w:val="Heading2"/>
-        <w:jc w:val="both"/>
-      </w:pPr>
-    </w:p>
-    <w:p>
-      <w:pPr>
-        <w:pStyle w:val="Heading2"/>
-        <w:jc w:val="both"/>
-      </w:pPr>
-    </w:p>
-    <w:p>
-      <w:pPr>
-        <w:pStyle w:val="Heading2"/>
-        <w:jc w:val="both"/>
-      </w:pPr>
-    </w:p>
-    <w:p>
-      <w:pPr>
-        <w:jc w:val="both"/>
-      </w:pPr>
-    </w:p>
-    <w:p>
-      <w:pPr>
-        <w:pStyle w:val="Heading1"/>
-        <w:jc w:val="both"/>
-      </w:pPr>
+      <w:bookmarkStart w:id="20" w:name="_GoBack"/>
+      <w:bookmarkEnd w:id="20"/>
     </w:p>
     <w:sectPr>
       <w:pgSz w:w="12240" w:h="15840"/>
@@ -10463,6 +10453,29 @@
       <w:ind w:left="220"/>
     </w:pPr>
   </w:style>
+  <w:style w:type="character" w:styleId="FollowedHyperlink">
+    <w:name w:val="FollowedHyperlink"/>
+    <w:basedOn w:val="DefaultParagraphFont"/>
+    <w:uiPriority w:val="99"/>
+    <w:semiHidden/>
+    <w:unhideWhenUsed/>
+    <w:rsid w:val="001F4FC1"/>
+    <w:rPr>
+      <w:color w:val="954F72" w:themeColor="followedHyperlink"/>
+      <w:u w:val="single"/>
+    </w:rPr>
+  </w:style>
+  <w:style w:type="paragraph" w:styleId="ListParagraph">
+    <w:name w:val="List Paragraph"/>
+    <w:basedOn w:val="Normal"/>
+    <w:uiPriority w:val="34"/>
+    <w:qFormat/>
+    <w:rsid w:val="0099508C"/>
+    <w:pPr>
+      <w:ind w:left="720"/>
+      <w:contextualSpacing/>
+    </w:pPr>
+  </w:style>
 </w:styles>
 </file>
 
@@ -10607,7 +10620,9 @@
   <w:rsids>
     <w:rsidRoot w:val="00142C4A"/>
     <w:rsid w:val="00142C4A"/>
+    <w:rsid w:val="00483EBE"/>
     <w:rsid w:val="00667DF1"/>
+    <w:rsid w:val="00D4739A"/>
   </w:rsids>
   <m:mathPr>
     <m:mathFont m:val="Cambria Math"/>

</xml_diff>